<commit_message>
Se agrega Modelo Entidad Relación
</commit_message>
<xml_diff>
--- a/PropuestaProyecto/Diccionario de datos DB.docx
+++ b/PropuestaProyecto/Diccionario de datos DB.docx
@@ -196,11 +196,9 @@
             <w:tcW w:w="1451" w:type="dxa"/>
           </w:tcPr>
           <w:p>
-            <w:proofErr w:type="spellStart"/>
             <w:r>
               <w:t>bigint</w:t>
             </w:r>
-            <w:proofErr w:type="spellEnd"/>
           </w:p>
         </w:tc>
         <w:tc>
@@ -248,11 +246,9 @@
             <w:tcW w:w="1984" w:type="dxa"/>
           </w:tcPr>
           <w:p>
-            <w:proofErr w:type="spellStart"/>
             <w:r>
               <w:t>auto_increment</w:t>
             </w:r>
-            <w:proofErr w:type="spellEnd"/>
           </w:p>
         </w:tc>
       </w:tr>
@@ -272,11 +268,9 @@
             <w:tcW w:w="1451" w:type="dxa"/>
           </w:tcPr>
           <w:p>
-            <w:proofErr w:type="spellStart"/>
             <w:r>
               <w:t>Varchar</w:t>
             </w:r>
-            <w:proofErr w:type="spellEnd"/>
           </w:p>
         </w:tc>
         <w:tc>
@@ -336,11 +330,9 @@
             <w:tcW w:w="1809" w:type="dxa"/>
           </w:tcPr>
           <w:p>
-            <w:proofErr w:type="spellStart"/>
             <w:r>
               <w:t>fecha_cita</w:t>
             </w:r>
-            <w:proofErr w:type="spellEnd"/>
           </w:p>
         </w:tc>
         <w:tc>
@@ -410,11 +402,9 @@
             <w:tcW w:w="1809" w:type="dxa"/>
           </w:tcPr>
           <w:p>
-            <w:proofErr w:type="spellStart"/>
             <w:r>
               <w:t>hora_inicio</w:t>
             </w:r>
-            <w:proofErr w:type="spellEnd"/>
           </w:p>
         </w:tc>
         <w:tc>
@@ -484,14 +474,12 @@
             <w:tcW w:w="1809" w:type="dxa"/>
           </w:tcPr>
           <w:p>
-            <w:proofErr w:type="spellStart"/>
             <w:r>
               <w:t>h</w:t>
             </w:r>
             <w:r>
               <w:t>ora_fin</w:t>
             </w:r>
-            <w:proofErr w:type="spellEnd"/>
           </w:p>
         </w:tc>
         <w:tc>
@@ -561,11 +549,9 @@
             <w:tcW w:w="1809" w:type="dxa"/>
           </w:tcPr>
           <w:p>
-            <w:proofErr w:type="spellStart"/>
             <w:r>
               <w:t>nombre_paciente</w:t>
             </w:r>
-            <w:proofErr w:type="spellEnd"/>
           </w:p>
         </w:tc>
         <w:tc>
@@ -573,11 +559,9 @@
             <w:tcW w:w="1451" w:type="dxa"/>
           </w:tcPr>
           <w:p>
-            <w:proofErr w:type="spellStart"/>
             <w:r>
               <w:t>varchar</w:t>
             </w:r>
-            <w:proofErr w:type="spellEnd"/>
           </w:p>
         </w:tc>
         <w:tc>
@@ -647,11 +631,9 @@
             <w:tcW w:w="1451" w:type="dxa"/>
           </w:tcPr>
           <w:p>
-            <w:proofErr w:type="spellStart"/>
             <w:r>
               <w:t>varchar</w:t>
             </w:r>
-            <w:proofErr w:type="spellEnd"/>
           </w:p>
         </w:tc>
         <w:tc>
@@ -711,11 +693,9 @@
             <w:tcW w:w="1809" w:type="dxa"/>
           </w:tcPr>
           <w:p>
-            <w:proofErr w:type="spellStart"/>
             <w:r>
               <w:t>telefono</w:t>
             </w:r>
-            <w:proofErr w:type="spellEnd"/>
           </w:p>
         </w:tc>
         <w:tc>
@@ -723,11 +703,9 @@
             <w:tcW w:w="1451" w:type="dxa"/>
           </w:tcPr>
           <w:p>
-            <w:proofErr w:type="spellStart"/>
             <w:r>
               <w:t>varchar</w:t>
             </w:r>
-            <w:proofErr w:type="spellEnd"/>
           </w:p>
         </w:tc>
         <w:tc>
@@ -765,13 +743,8 @@
             <w:tcW w:w="2940" w:type="dxa"/>
           </w:tcPr>
           <w:p>
-            <w:proofErr w:type="spellStart"/>
-            <w:r>
-              <w:t>Telefono</w:t>
-            </w:r>
-            <w:proofErr w:type="spellEnd"/>
-            <w:r>
-              <w:t xml:space="preserve"> del paciente </w:t>
+            <w:r>
+              <w:t xml:space="preserve">Telefono del paciente </w:t>
             </w:r>
           </w:p>
         </w:tc>
@@ -792,11 +765,9 @@
             <w:tcW w:w="1809" w:type="dxa"/>
           </w:tcPr>
           <w:p>
-            <w:proofErr w:type="spellStart"/>
             <w:r>
               <w:t>uuid</w:t>
             </w:r>
-            <w:proofErr w:type="spellEnd"/>
           </w:p>
         </w:tc>
         <w:tc>
@@ -804,11 +775,9 @@
             <w:tcW w:w="1451" w:type="dxa"/>
           </w:tcPr>
           <w:p>
-            <w:proofErr w:type="spellStart"/>
             <w:r>
               <w:t>binary</w:t>
             </w:r>
-            <w:proofErr w:type="spellEnd"/>
           </w:p>
         </w:tc>
         <w:tc>
@@ -836,11 +805,9 @@
             <w:tcW w:w="746" w:type="dxa"/>
           </w:tcPr>
           <w:p>
-            <w:proofErr w:type="spellStart"/>
             <w:r>
               <w:t>unique</w:t>
             </w:r>
-            <w:proofErr w:type="spellEnd"/>
           </w:p>
         </w:tc>
         <w:tc>
@@ -1038,11 +1005,9 @@
             <w:tcW w:w="1813" w:type="dxa"/>
           </w:tcPr>
           <w:p>
-            <w:proofErr w:type="spellStart"/>
             <w:r>
               <w:t>servicio_id</w:t>
             </w:r>
-            <w:proofErr w:type="spellEnd"/>
           </w:p>
         </w:tc>
         <w:tc>
@@ -1050,11 +1015,9 @@
             <w:tcW w:w="1390" w:type="dxa"/>
           </w:tcPr>
           <w:p>
-            <w:proofErr w:type="spellStart"/>
             <w:r>
               <w:t>bigint</w:t>
             </w:r>
-            <w:proofErr w:type="spellEnd"/>
           </w:p>
         </w:tc>
         <w:tc>
@@ -1102,11 +1065,9 @@
             <w:tcW w:w="2006" w:type="dxa"/>
           </w:tcPr>
           <w:p>
-            <w:proofErr w:type="spellStart"/>
             <w:r>
               <w:t>auto_increment</w:t>
             </w:r>
-            <w:proofErr w:type="spellEnd"/>
           </w:p>
         </w:tc>
       </w:tr>
@@ -1116,11 +1077,9 @@
             <w:tcW w:w="1813" w:type="dxa"/>
           </w:tcPr>
           <w:p>
-            <w:proofErr w:type="spellStart"/>
             <w:r>
               <w:t>duracion</w:t>
             </w:r>
-            <w:proofErr w:type="spellEnd"/>
           </w:p>
         </w:tc>
         <w:tc>
@@ -1128,11 +1087,9 @@
             <w:tcW w:w="1390" w:type="dxa"/>
           </w:tcPr>
           <w:p>
-            <w:proofErr w:type="spellStart"/>
             <w:r>
               <w:t>varchar</w:t>
             </w:r>
-            <w:proofErr w:type="spellEnd"/>
           </w:p>
         </w:tc>
         <w:tc>
@@ -1192,11 +1149,9 @@
             <w:tcW w:w="1813" w:type="dxa"/>
           </w:tcPr>
           <w:p>
-            <w:proofErr w:type="spellStart"/>
             <w:r>
               <w:t>nombre_servicio</w:t>
             </w:r>
-            <w:proofErr w:type="spellEnd"/>
           </w:p>
         </w:tc>
         <w:tc>
@@ -1204,11 +1159,9 @@
             <w:tcW w:w="1390" w:type="dxa"/>
           </w:tcPr>
           <w:p>
-            <w:proofErr w:type="spellStart"/>
             <w:r>
               <w:t>varchar</w:t>
             </w:r>
-            <w:proofErr w:type="spellEnd"/>
           </w:p>
         </w:tc>
         <w:tc>
@@ -1278,11 +1231,9 @@
             <w:tcW w:w="1390" w:type="dxa"/>
           </w:tcPr>
           <w:p>
-            <w:proofErr w:type="spellStart"/>
             <w:r>
               <w:t>varchar</w:t>
             </w:r>
-            <w:proofErr w:type="spellEnd"/>
           </w:p>
         </w:tc>
         <w:tc>
@@ -1338,11 +1289,9 @@
             <w:tcW w:w="1813" w:type="dxa"/>
           </w:tcPr>
           <w:p>
-            <w:proofErr w:type="spellStart"/>
             <w:r>
               <w:t>servicio_uuid</w:t>
             </w:r>
-            <w:proofErr w:type="spellEnd"/>
           </w:p>
         </w:tc>
         <w:tc>
@@ -1350,11 +1299,9 @@
             <w:tcW w:w="1390" w:type="dxa"/>
           </w:tcPr>
           <w:p>
-            <w:proofErr w:type="spellStart"/>
             <w:r>
               <w:t>binary</w:t>
             </w:r>
-            <w:proofErr w:type="spellEnd"/>
           </w:p>
         </w:tc>
         <w:tc>
@@ -1382,11 +1329,9 @@
             <w:tcW w:w="851" w:type="dxa"/>
           </w:tcPr>
           <w:p>
-            <w:proofErr w:type="spellStart"/>
             <w:r>
               <w:t>unique</w:t>
             </w:r>
-            <w:proofErr w:type="spellEnd"/>
           </w:p>
         </w:tc>
         <w:tc>
@@ -1592,14 +1537,9 @@
                 <w:tab w:val="center" w:pos="836"/>
               </w:tabs>
             </w:pPr>
-            <w:proofErr w:type="spellStart"/>
-            <w:r>
-              <w:t>horario_</w:t>
-            </w:r>
-            <w:r>
-              <w:t>id</w:t>
-            </w:r>
-            <w:proofErr w:type="spellEnd"/>
+            <w:r>
+              <w:t>horario_id</w:t>
+            </w:r>
             <w:r>
               <w:tab/>
             </w:r>
@@ -1610,11 +1550,9 @@
             <w:tcW w:w="1405" w:type="dxa"/>
           </w:tcPr>
           <w:p>
-            <w:proofErr w:type="spellStart"/>
             <w:r>
               <w:t>bigint</w:t>
             </w:r>
-            <w:proofErr w:type="spellEnd"/>
           </w:p>
         </w:tc>
         <w:tc>
@@ -1662,11 +1600,9 @@
             <w:tcW w:w="1961" w:type="dxa"/>
           </w:tcPr>
           <w:p>
-            <w:proofErr w:type="spellStart"/>
             <w:r>
               <w:t>auto_increment</w:t>
             </w:r>
-            <w:proofErr w:type="spellEnd"/>
           </w:p>
         </w:tc>
       </w:tr>
@@ -1676,11 +1612,9 @@
             <w:tcW w:w="1888" w:type="dxa"/>
           </w:tcPr>
           <w:p>
-            <w:proofErr w:type="spellStart"/>
             <w:r>
               <w:t>hora_inicio</w:t>
             </w:r>
-            <w:proofErr w:type="spellEnd"/>
           </w:p>
         </w:tc>
         <w:tc>
@@ -1753,11 +1687,9 @@
             <w:tcW w:w="1888" w:type="dxa"/>
           </w:tcPr>
           <w:p>
-            <w:proofErr w:type="spellStart"/>
             <w:r>
               <w:t>hora_fin</w:t>
             </w:r>
-            <w:proofErr w:type="spellEnd"/>
           </w:p>
         </w:tc>
         <w:tc>
@@ -1830,11 +1762,9 @@
             <w:tcW w:w="1888" w:type="dxa"/>
           </w:tcPr>
           <w:p>
-            <w:proofErr w:type="spellStart"/>
             <w:r>
               <w:t>dia</w:t>
             </w:r>
-            <w:proofErr w:type="spellEnd"/>
           </w:p>
         </w:tc>
         <w:tc>
@@ -1842,11 +1772,9 @@
             <w:tcW w:w="1405" w:type="dxa"/>
           </w:tcPr>
           <w:p>
-            <w:proofErr w:type="spellStart"/>
             <w:r>
               <w:t>varchar</w:t>
             </w:r>
-            <w:proofErr w:type="spellEnd"/>
           </w:p>
         </w:tc>
         <w:tc>
@@ -1906,11 +1834,9 @@
             <w:tcW w:w="1888" w:type="dxa"/>
           </w:tcPr>
           <w:p>
-            <w:proofErr w:type="spellStart"/>
             <w:r>
               <w:t>uuid</w:t>
             </w:r>
-            <w:proofErr w:type="spellEnd"/>
           </w:p>
         </w:tc>
         <w:tc>
@@ -1918,11 +1844,9 @@
             <w:tcW w:w="1405" w:type="dxa"/>
           </w:tcPr>
           <w:p>
-            <w:proofErr w:type="spellStart"/>
             <w:r>
               <w:t>binary</w:t>
             </w:r>
-            <w:proofErr w:type="spellEnd"/>
           </w:p>
         </w:tc>
         <w:tc>
@@ -1950,11 +1874,9 @@
             <w:tcW w:w="875" w:type="dxa"/>
           </w:tcPr>
           <w:p>
-            <w:proofErr w:type="spellStart"/>
             <w:r>
               <w:t>unique</w:t>
             </w:r>
-            <w:proofErr w:type="spellEnd"/>
           </w:p>
         </w:tc>
         <w:tc>
@@ -1988,7 +1910,10 @@
         <w:pStyle w:val="Ttulo1"/>
       </w:pPr>
       <w:r>
-        <w:t xml:space="preserve">Modelo entidad relación </w:t>
+        <w:t xml:space="preserve">Diagrama Relacional </w:t>
+      </w:r>
+      <w:r>
+        <w:t xml:space="preserve"> </w:t>
       </w:r>
     </w:p>
     <w:p/>
@@ -2047,8 +1972,68 @@
         </w:drawing>
       </w:r>
     </w:p>
+    <w:p/>
+    <w:p/>
+    <w:p/>
+    <w:p/>
+    <w:p/>
+    <w:p/>
+    <w:p/>
+    <w:p/>
+    <w:p/>
+    <w:p/>
+    <w:p/>
+    <w:p/>
+    <w:p>
+      <w:pPr>
+        <w:pStyle w:val="Ttulo2"/>
+      </w:pPr>
+      <w:r>
+        <w:lastRenderedPageBreak/>
+        <w:t xml:space="preserve">Modelo Entidad Relación </w:t>
+      </w:r>
+    </w:p>
+    <w:p>
+      <w:r>
+        <w:drawing>
+          <wp:inline distT="0" distB="0" distL="0" distR="0" wp14:anchorId="13101804" wp14:editId="45AC6284">
+            <wp:extent cx="6858000" cy="4232910"/>
+            <wp:effectExtent l="0" t="0" r="0" b="0"/>
+            <wp:docPr id="1" name="Imagen 1"/>
+            <wp:cNvGraphicFramePr>
+              <a:graphicFrameLocks xmlns:a="http://schemas.openxmlformats.org/drawingml/2006/main" noChangeAspect="1"/>
+            </wp:cNvGraphicFramePr>
+            <a:graphic xmlns:a="http://schemas.openxmlformats.org/drawingml/2006/main">
+              <a:graphicData uri="http://schemas.openxmlformats.org/drawingml/2006/picture">
+                <pic:pic xmlns:pic="http://schemas.openxmlformats.org/drawingml/2006/picture">
+                  <pic:nvPicPr>
+                    <pic:cNvPr id="1" name=""/>
+                    <pic:cNvPicPr/>
+                  </pic:nvPicPr>
+                  <pic:blipFill>
+                    <a:blip r:embed="rId7"/>
+                    <a:stretch>
+                      <a:fillRect/>
+                    </a:stretch>
+                  </pic:blipFill>
+                  <pic:spPr>
+                    <a:xfrm>
+                      <a:off x="0" y="0"/>
+                      <a:ext cx="6858000" cy="4232910"/>
+                    </a:xfrm>
+                    <a:prstGeom prst="rect">
+                      <a:avLst/>
+                    </a:prstGeom>
+                  </pic:spPr>
+                </pic:pic>
+              </a:graphicData>
+            </a:graphic>
+          </wp:inline>
+        </w:drawing>
+      </w:r>
+    </w:p>
     <w:sectPr>
-      <w:headerReference w:type="default" r:id="rId7"/>
+      <w:headerReference w:type="default" r:id="rId8"/>
       <w:pgSz w:w="12240" w:h="15840"/>
       <w:pgMar w:top="720" w:right="720" w:bottom="720" w:left="720" w:header="708" w:footer="708" w:gutter="0"/>
       <w:cols w:space="708"/>

</xml_diff>